<commit_message>
feat: integrate Tailwind CSS and update styles
- Replaced font with 'Plus Jakarta Sans' and added Tailwind CSS imports in index.css.
- Updated scrollbar styles and selection colors for better UI consistency.
- Modified Vite configuration to include Tailwind CSS plugin and set up path aliasing.
- Added a new API endpoint for converting DOCX files to PDF using Puppeteer and Chromium.
- Created reusable UI components: Button, Card, Input, Label, Separator, Textarea, and their respective styles.
- Implemented utility function for class name merging.
- Configured Vercel settings for the new API function.
</commit_message>
<xml_diff>
--- a/public/bahan/Konfirmasi-Bank-Template.docx
+++ b/public/bahan/Konfirmasi-Bank-Template.docx
@@ -1,6 +1,6 @@
 
 <file path=word/document.xml><?xml version="1.0" encoding="utf-8"?>
-<w:document xmlns:wpc="http://schemas.microsoft.com/office/word/2010/wordprocessingCanvas" xmlns:cx="http://schemas.microsoft.com/office/drawing/2014/chartex" xmlns:cx1="http://schemas.microsoft.com/office/drawing/2015/9/8/chartex" xmlns:cx2="http://schemas.microsoft.com/office/drawing/2015/10/21/chartex" xmlns:cx3="http://schemas.microsoft.com/office/drawing/2016/5/9/chartex" xmlns:cx4="http://schemas.microsoft.com/office/drawing/2016/5/10/chartex" xmlns:cx5="http://schemas.microsoft.com/office/drawing/2016/5/11/chartex" xmlns:cx6="http://schemas.microsoft.com/office/drawing/2016/5/12/chartex" xmlns:cx7="http://schemas.microsoft.com/office/drawing/2016/5/13/chartex" xmlns:cx8="http://schemas.microsoft.com/office/drawing/2016/5/14/chartex" xmlns:mc="http://schemas.openxmlformats.org/markup-compatibility/2006" xmlns:aink="http://schemas.microsoft.com/office/drawing/2016/ink" xmlns:am3d="http://schemas.microsoft.com/office/drawing/2017/model3d" xmlns:o="urn:schemas-microsoft-com:office:office" xmlns:oel="http://schemas.microsoft.com/office/2019/extlst" xmlns:r="http://schemas.openxmlformats.org/officeDocument/2006/relationships" xmlns:m="http://schemas.openxmlformats.org/officeDocument/2006/math" xmlns:v="urn:schemas-microsoft-com:vml" xmlns:wp14="http://schemas.microsoft.com/office/word/2010/wordprocessingDrawing" xmlns:wp="http://schemas.openxmlformats.org/drawingml/2006/wordprocessingDrawing" xmlns:w10="urn:schemas-microsoft-com:office:word" xmlns:w="http://schemas.openxmlformats.org/wordprocessingml/2006/main" xmlns:w14="http://schemas.microsoft.com/office/word/2010/wordml" xmlns:w15="http://schemas.microsoft.com/office/word/2012/wordml" xmlns:w16cex="http://schemas.microsoft.com/office/word/2018/wordml/cex" xmlns:w16cid="http://schemas.microsoft.com/office/word/2016/wordml/cid" xmlns:w16="http://schemas.microsoft.com/office/word/2018/wordml" xmlns:w16du="http://schemas.microsoft.com/office/word/2023/wordml/word16du" xmlns:w16sdtdh="http://schemas.microsoft.com/office/word/2020/wordml/sdtdatahash" xmlns:w16sdtfl="http://schemas.microsoft.com/office/word/2024/wordml/sdtformatlock" xmlns:w16se="http://schemas.microsoft.com/office/word/2015/wordml/symex" xmlns:wpg="http://schemas.microsoft.com/office/word/2010/wordprocessingGroup" xmlns:wpi="http://schemas.microsoft.com/office/word/2010/wordprocessingInk" xmlns:wne="http://schemas.microsoft.com/office/word/2006/wordml" xmlns:wps="http://schemas.microsoft.com/office/word/2010/wordprocessingShape" mc:Ignorable="w14 w15 w16se w16cid w16 w16cex w16sdtdh w16sdtfl w16du wp14">
+<w:document xmlns:wpc="http://schemas.microsoft.com/office/word/2010/wordprocessingCanvas" xmlns:cx="http://schemas.microsoft.com/office/drawing/2014/chartex" xmlns:cx1="http://schemas.microsoft.com/office/drawing/2015/9/8/chartex" xmlns:cx2="http://schemas.microsoft.com/office/drawing/2015/10/21/chartex" xmlns:cx3="http://schemas.microsoft.com/office/drawing/2016/5/9/chartex" xmlns:cx4="http://schemas.microsoft.com/office/drawing/2016/5/10/chartex" xmlns:cx5="http://schemas.microsoft.com/office/drawing/2016/5/11/chartex" xmlns:cx6="http://schemas.microsoft.com/office/drawing/2016/5/12/chartex" xmlns:cx7="http://schemas.microsoft.com/office/drawing/2016/5/13/chartex" xmlns:cx8="http://schemas.microsoft.com/office/drawing/2016/5/14/chartex" xmlns:mc="http://schemas.openxmlformats.org/markup-compatibility/2006" xmlns:aink="http://schemas.microsoft.com/office/drawing/2016/ink" xmlns:am3d="http://schemas.microsoft.com/office/drawing/2017/model3d" xmlns:o="urn:schemas-microsoft-com:office:office" xmlns:oel="http://schemas.microsoft.com/office/2019/extlst" xmlns:r="http://schemas.openxmlformats.org/officeDocument/2006/relationships" xmlns:m="http://schemas.openxmlformats.org/officeDocument/2006/math" xmlns:v="urn:schemas-microsoft-com:vml" xmlns:wp14="http://schemas.microsoft.com/office/word/2010/wordprocessingDrawing" xmlns:wp="http://schemas.openxmlformats.org/drawingml/2006/wordprocessingDrawing" xmlns:w10="urn:schemas-microsoft-com:office:word" xmlns:w="http://schemas.openxmlformats.org/wordprocessingml/2006/main" xmlns:w14="http://schemas.microsoft.com/office/word/2010/wordml" xmlns:w15="http://schemas.microsoft.com/office/word/2012/wordml" xmlns:w16cex="http://schemas.microsoft.com/office/word/2018/wordml/cex" xmlns:w16cid="http://schemas.microsoft.com/office/word/2016/wordml/cid" xmlns:w16="http://schemas.microsoft.com/office/word/2018/wordml" xmlns:w16sdtdh="http://schemas.microsoft.com/office/word/2020/wordml/sdtdatahash" xmlns:w16se="http://schemas.microsoft.com/office/word/2015/wordml/symex" xmlns:wpg="http://schemas.microsoft.com/office/word/2010/wordprocessingGroup" xmlns:wpi="http://schemas.microsoft.com/office/word/2010/wordprocessingInk" xmlns:wne="http://schemas.microsoft.com/office/word/2006/wordml" xmlns:wps="http://schemas.microsoft.com/office/word/2010/wordprocessingShape" mc:Ignorable="w14 w15 w16se w16cid w16 w16cex w16sdtdh wp14">
   <w:body>
     <w:p>
       <w:pPr>
@@ -201,7 +201,29 @@
           <w:sz w:val="20"/>
           <w:szCs w:val="20"/>
         </w:rPr>
-        <w:t xml:space="preserve"> Budi Santosa &amp; Rekan Cabang </w:t>
+        <w:t xml:space="preserve"> Budi </w:t>
+      </w:r>
+      <w:proofErr w:type="spellStart"/>
+      <w:r>
+        <w:rPr>
+          <w:rFonts w:cs="Calibri"/>
+          <w:b/>
+          <w:color w:val="000000"/>
+          <w:sz w:val="20"/>
+          <w:szCs w:val="20"/>
+        </w:rPr>
+        <w:t>Santosa</w:t>
+      </w:r>
+      <w:proofErr w:type="spellEnd"/>
+      <w:r>
+        <w:rPr>
+          <w:rFonts w:cs="Calibri"/>
+          <w:b/>
+          <w:color w:val="000000"/>
+          <w:sz w:val="20"/>
+          <w:szCs w:val="20"/>
+        </w:rPr>
+        <w:t xml:space="preserve"> &amp; Rekan Cabang </w:t>
       </w:r>
       <w:proofErr w:type="spellStart"/>
       <w:r>
@@ -464,7 +486,52 @@
           <w:sz w:val="20"/>
           <w:szCs w:val="20"/>
         </w:rPr>
-        <w:t xml:space="preserve"> (62) 821 5555 4992 / (62) 812 9588 9147</w:t>
+        <w:t xml:space="preserve"> (62) </w:t>
+      </w:r>
+      <w:r>
+        <w:rPr>
+          <w:rFonts w:cs="Calibri"/>
+          <w:color w:val="000000"/>
+          <w:sz w:val="20"/>
+          <w:szCs w:val="20"/>
+        </w:rPr>
+        <w:t>{{nomor_hp1}}</w:t>
+      </w:r>
+      <w:r>
+        <w:rPr>
+          <w:rFonts w:cs="Calibri"/>
+          <w:color w:val="000000"/>
+          <w:sz w:val="20"/>
+          <w:szCs w:val="20"/>
+        </w:rPr>
+        <w:t xml:space="preserve"> / (62) </w:t>
+      </w:r>
+      <w:r>
+        <w:rPr>
+          <w:rFonts w:cs="Calibri"/>
+          <w:color w:val="000000"/>
+          <w:sz w:val="20"/>
+          <w:szCs w:val="20"/>
+        </w:rPr>
+        <w:t>{{nomor_hp</w:t>
+      </w:r>
+      <w:r>
+        <w:rPr>
+          <w:rFonts w:cs="Calibri"/>
+          <w:color w:val="000000"/>
+          <w:sz w:val="20"/>
+          <w:szCs w:val="20"/>
+        </w:rPr>
+        <w:t>2</w:t>
+      </w:r>
+      <w:r>
+        <w:rPr>
+          <w:rFonts w:cs="Calibri"/>
+          <w:color w:val="000000"/>
+          <w:sz w:val="20"/>
+          <w:szCs w:val="20"/>
+        </w:rPr>
+        <w:t>}}</w:t>
       </w:r>
     </w:p>
     <w:p>
@@ -873,7 +940,7 @@
               </wp:anchor>
             </w:drawing>
           </mc:Choice>
-          <mc:Fallback>
+          <mc:Fallback xmlns:w16sdtfl="http://schemas.microsoft.com/office/word/2024/wordml/sdtformatlock" xmlns:w16du="http://schemas.microsoft.com/office/word/2023/wordml/word16du">
             <w:pict>
               <v:line w14:anchorId="57A81C93" id="Straight Connector 2" o:spid="_x0000_s1026" style="position:absolute;z-index:251656704;visibility:visible;mso-wrap-style:square;mso-wrap-distance-left:9pt;mso-wrap-distance-top:0;mso-wrap-distance-right:9pt;mso-wrap-distance-bottom:0;mso-position-horizontal:left;mso-position-horizontal-relative:margin;mso-position-vertical:absolute;mso-position-vertical-relative:text" from="0,.9pt" to="128.1pt,.9pt" o:gfxdata="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" strokecolor="black [3200]" strokeweight="1pt">
                 <v:stroke joinstyle="miter"/>
@@ -951,7 +1018,7 @@
               </wp:anchor>
             </w:drawing>
           </mc:Choice>
-          <mc:Fallback>
+          <mc:Fallback xmlns:w16sdtfl="http://schemas.microsoft.com/office/word/2024/wordml/sdtformatlock" xmlns:w16du="http://schemas.microsoft.com/office/word/2023/wordml/word16du">
             <w:pict>
               <v:line w14:anchorId="246ED8AA" id="Straight Connector 4" o:spid="_x0000_s1026" style="position:absolute;z-index:251657728;visibility:visible;mso-wrap-style:square;mso-wrap-distance-left:9pt;mso-wrap-distance-top:0;mso-wrap-distance-right:9pt;mso-wrap-distance-bottom:0;mso-position-horizontal:left;mso-position-horizontal-relative:margin;mso-position-vertical:absolute;mso-position-vertical-relative:text" from="0,1.25pt" to="128.05pt,1.25pt" o:gfxdata="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" strokecolor="black [3200]" strokeweight="1pt">
                 <v:stroke joinstyle="miter"/>
@@ -1348,13 +1415,23 @@
           <w:szCs w:val="20"/>
         </w:rPr>
       </w:pPr>
-      <w:r>
-        <w:rPr>
-          <w:rFonts w:ascii="Arial Narrow" w:eastAsia="Times New Roman" w:hAnsi="Arial Narrow"/>
-          <w:sz w:val="20"/>
-          <w:szCs w:val="20"/>
-        </w:rPr>
-        <w:t>Saldo(-</w:t>
+      <w:proofErr w:type="spellStart"/>
+      <w:r>
+        <w:rPr>
+          <w:rFonts w:ascii="Arial Narrow" w:eastAsia="Times New Roman" w:hAnsi="Arial Narrow"/>
+          <w:sz w:val="20"/>
+          <w:szCs w:val="20"/>
+        </w:rPr>
+        <w:t>Saldo</w:t>
+      </w:r>
+      <w:proofErr w:type="spellEnd"/>
+      <w:r>
+        <w:rPr>
+          <w:rFonts w:ascii="Arial Narrow" w:eastAsia="Times New Roman" w:hAnsi="Arial Narrow"/>
+          <w:sz w:val="20"/>
+          <w:szCs w:val="20"/>
+        </w:rPr>
+        <w:t>(-</w:t>
       </w:r>
       <w:proofErr w:type="spellStart"/>
       <w:r>
@@ -1426,7 +1503,25 @@
           <w:sz w:val="20"/>
           <w:szCs w:val="20"/>
         </w:rPr>
-        <w:t xml:space="preserve"> nama </w:t>
+        <w:t xml:space="preserve"> </w:t>
+      </w:r>
+      <w:proofErr w:type="spellStart"/>
+      <w:r>
+        <w:rPr>
+          <w:rFonts w:ascii="Arial Narrow" w:eastAsia="Times New Roman" w:hAnsi="Arial Narrow"/>
+          <w:sz w:val="20"/>
+          <w:szCs w:val="20"/>
+        </w:rPr>
+        <w:t>nama</w:t>
+      </w:r>
+      <w:proofErr w:type="spellEnd"/>
+      <w:r>
+        <w:rPr>
+          <w:rFonts w:ascii="Arial Narrow" w:eastAsia="Times New Roman" w:hAnsi="Arial Narrow"/>
+          <w:sz w:val="20"/>
+          <w:szCs w:val="20"/>
+        </w:rPr>
+        <w:t xml:space="preserve"> </w:t>
       </w:r>
       <w:proofErr w:type="spellStart"/>
       <w:r>
@@ -5797,7 +5892,6 @@
         <w:t xml:space="preserve"> swap, </w:t>
       </w:r>
       <w:proofErr w:type="spellStart"/>
-      <w:proofErr w:type="gramStart"/>
       <w:r>
         <w:rPr>
           <w:rFonts w:ascii="Arial Narrow" w:eastAsia="Times New Roman" w:hAnsi="Arial Narrow"/>
@@ -5807,7 +5901,6 @@
         <w:t>komitmen,dll</w:t>
       </w:r>
       <w:proofErr w:type="spellEnd"/>
-      <w:proofErr w:type="gramEnd"/>
       <w:r>
         <w:rPr>
           <w:rFonts w:ascii="Arial Narrow" w:eastAsia="Times New Roman" w:hAnsi="Arial Narrow"/>
@@ -6275,13 +6368,23 @@
           <w:szCs w:val="20"/>
         </w:rPr>
       </w:pPr>
-      <w:r>
-        <w:rPr>
-          <w:rFonts w:ascii="Arial Narrow" w:eastAsia="Times New Roman" w:hAnsi="Arial Narrow"/>
-          <w:sz w:val="20"/>
-          <w:szCs w:val="20"/>
-        </w:rPr>
-        <w:t xml:space="preserve">Selain </w:t>
+      <w:proofErr w:type="spellStart"/>
+      <w:r>
+        <w:rPr>
+          <w:rFonts w:ascii="Arial Narrow" w:eastAsia="Times New Roman" w:hAnsi="Arial Narrow"/>
+          <w:sz w:val="20"/>
+          <w:szCs w:val="20"/>
+        </w:rPr>
+        <w:t>Selain</w:t>
+      </w:r>
+      <w:proofErr w:type="spellEnd"/>
+      <w:r>
+        <w:rPr>
+          <w:rFonts w:ascii="Arial Narrow" w:eastAsia="Times New Roman" w:hAnsi="Arial Narrow"/>
+          <w:sz w:val="20"/>
+          <w:szCs w:val="20"/>
+        </w:rPr>
+        <w:t xml:space="preserve"> </w:t>
       </w:r>
       <w:proofErr w:type="spellStart"/>
       <w:r>
@@ -7281,7 +7384,7 @@
 </file>
 
 <file path=word/endnotes.xml><?xml version="1.0" encoding="utf-8"?>
-<w:endnotes xmlns:wpc="http://schemas.microsoft.com/office/word/2010/wordprocessingCanvas" xmlns:cx="http://schemas.microsoft.com/office/drawing/2014/chartex" xmlns:cx1="http://schemas.microsoft.com/office/drawing/2015/9/8/chartex" xmlns:cx2="http://schemas.microsoft.com/office/drawing/2015/10/21/chartex" xmlns:cx3="http://schemas.microsoft.com/office/drawing/2016/5/9/chartex" xmlns:cx4="http://schemas.microsoft.com/office/drawing/2016/5/10/chartex" xmlns:cx5="http://schemas.microsoft.com/office/drawing/2016/5/11/chartex" xmlns:cx6="http://schemas.microsoft.com/office/drawing/2016/5/12/chartex" xmlns:cx7="http://schemas.microsoft.com/office/drawing/2016/5/13/chartex" xmlns:cx8="http://schemas.microsoft.com/office/drawing/2016/5/14/chartex" xmlns:mc="http://schemas.openxmlformats.org/markup-compatibility/2006" xmlns:aink="http://schemas.microsoft.com/office/drawing/2016/ink" xmlns:am3d="http://schemas.microsoft.com/office/drawing/2017/model3d" xmlns:o="urn:schemas-microsoft-com:office:office" xmlns:oel="http://schemas.microsoft.com/office/2019/extlst" xmlns:r="http://schemas.openxmlformats.org/officeDocument/2006/relationships" xmlns:m="http://schemas.openxmlformats.org/officeDocument/2006/math" xmlns:v="urn:schemas-microsoft-com:vml" xmlns:wp14="http://schemas.microsoft.com/office/word/2010/wordprocessingDrawing" xmlns:wp="http://schemas.openxmlformats.org/drawingml/2006/wordprocessingDrawing" xmlns:w10="urn:schemas-microsoft-com:office:word" xmlns:w="http://schemas.openxmlformats.org/wordprocessingml/2006/main" xmlns:w14="http://schemas.microsoft.com/office/word/2010/wordml" xmlns:w15="http://schemas.microsoft.com/office/word/2012/wordml" xmlns:w16cex="http://schemas.microsoft.com/office/word/2018/wordml/cex" xmlns:w16cid="http://schemas.microsoft.com/office/word/2016/wordml/cid" xmlns:w16="http://schemas.microsoft.com/office/word/2018/wordml" xmlns:w16du="http://schemas.microsoft.com/office/word/2023/wordml/word16du" xmlns:w16sdtdh="http://schemas.microsoft.com/office/word/2020/wordml/sdtdatahash" xmlns:w16sdtfl="http://schemas.microsoft.com/office/word/2024/wordml/sdtformatlock" xmlns:w16se="http://schemas.microsoft.com/office/word/2015/wordml/symex" xmlns:wpg="http://schemas.microsoft.com/office/word/2010/wordprocessingGroup" xmlns:wpi="http://schemas.microsoft.com/office/word/2010/wordprocessingInk" xmlns:wne="http://schemas.microsoft.com/office/word/2006/wordml" xmlns:wps="http://schemas.microsoft.com/office/word/2010/wordprocessingShape" mc:Ignorable="w14 w15 w16se w16cid w16 w16cex w16sdtdh w16sdtfl w16du wp14">
+<w:endnotes xmlns:wpc="http://schemas.microsoft.com/office/word/2010/wordprocessingCanvas" xmlns:cx="http://schemas.microsoft.com/office/drawing/2014/chartex" xmlns:cx1="http://schemas.microsoft.com/office/drawing/2015/9/8/chartex" xmlns:cx2="http://schemas.microsoft.com/office/drawing/2015/10/21/chartex" xmlns:cx3="http://schemas.microsoft.com/office/drawing/2016/5/9/chartex" xmlns:cx4="http://schemas.microsoft.com/office/drawing/2016/5/10/chartex" xmlns:cx5="http://schemas.microsoft.com/office/drawing/2016/5/11/chartex" xmlns:cx6="http://schemas.microsoft.com/office/drawing/2016/5/12/chartex" xmlns:cx7="http://schemas.microsoft.com/office/drawing/2016/5/13/chartex" xmlns:cx8="http://schemas.microsoft.com/office/drawing/2016/5/14/chartex" xmlns:mc="http://schemas.openxmlformats.org/markup-compatibility/2006" xmlns:aink="http://schemas.microsoft.com/office/drawing/2016/ink" xmlns:am3d="http://schemas.microsoft.com/office/drawing/2017/model3d" xmlns:o="urn:schemas-microsoft-com:office:office" xmlns:oel="http://schemas.microsoft.com/office/2019/extlst" xmlns:r="http://schemas.openxmlformats.org/officeDocument/2006/relationships" xmlns:m="http://schemas.openxmlformats.org/officeDocument/2006/math" xmlns:v="urn:schemas-microsoft-com:vml" xmlns:wp14="http://schemas.microsoft.com/office/word/2010/wordprocessingDrawing" xmlns:wp="http://schemas.openxmlformats.org/drawingml/2006/wordprocessingDrawing" xmlns:w10="urn:schemas-microsoft-com:office:word" xmlns:w="http://schemas.openxmlformats.org/wordprocessingml/2006/main" xmlns:w14="http://schemas.microsoft.com/office/word/2010/wordml" xmlns:w15="http://schemas.microsoft.com/office/word/2012/wordml" xmlns:w16cex="http://schemas.microsoft.com/office/word/2018/wordml/cex" xmlns:w16cid="http://schemas.microsoft.com/office/word/2016/wordml/cid" xmlns:w16="http://schemas.microsoft.com/office/word/2018/wordml" xmlns:w16sdtdh="http://schemas.microsoft.com/office/word/2020/wordml/sdtdatahash" xmlns:w16se="http://schemas.microsoft.com/office/word/2015/wordml/symex" xmlns:wpg="http://schemas.microsoft.com/office/word/2010/wordprocessingGroup" xmlns:wpi="http://schemas.microsoft.com/office/word/2010/wordprocessingInk" xmlns:wne="http://schemas.microsoft.com/office/word/2006/wordml" xmlns:wps="http://schemas.microsoft.com/office/word/2010/wordprocessingShape" mc:Ignorable="w14 w15 w16se w16cid w16 w16cex w16sdtdh wp14">
   <w:endnote w:type="separator" w:id="-1">
     <w:p>
       <w:pPr>
@@ -7306,7 +7409,7 @@
 </file>
 
 <file path=word/footer1.xml><?xml version="1.0" encoding="utf-8"?>
-<w:ftr xmlns:wpc="http://schemas.microsoft.com/office/word/2010/wordprocessingCanvas" xmlns:cx="http://schemas.microsoft.com/office/drawing/2014/chartex" xmlns:cx1="http://schemas.microsoft.com/office/drawing/2015/9/8/chartex" xmlns:cx2="http://schemas.microsoft.com/office/drawing/2015/10/21/chartex" xmlns:cx3="http://schemas.microsoft.com/office/drawing/2016/5/9/chartex" xmlns:cx4="http://schemas.microsoft.com/office/drawing/2016/5/10/chartex" xmlns:cx5="http://schemas.microsoft.com/office/drawing/2016/5/11/chartex" xmlns:cx6="http://schemas.microsoft.com/office/drawing/2016/5/12/chartex" xmlns:cx7="http://schemas.microsoft.com/office/drawing/2016/5/13/chartex" xmlns:cx8="http://schemas.microsoft.com/office/drawing/2016/5/14/chartex" xmlns:mc="http://schemas.openxmlformats.org/markup-compatibility/2006" xmlns:aink="http://schemas.microsoft.com/office/drawing/2016/ink" xmlns:am3d="http://schemas.microsoft.com/office/drawing/2017/model3d" xmlns:o="urn:schemas-microsoft-com:office:office" xmlns:oel="http://schemas.microsoft.com/office/2019/extlst" xmlns:r="http://schemas.openxmlformats.org/officeDocument/2006/relationships" xmlns:m="http://schemas.openxmlformats.org/officeDocument/2006/math" xmlns:v="urn:schemas-microsoft-com:vml" xmlns:wp14="http://schemas.microsoft.com/office/word/2010/wordprocessingDrawing" xmlns:wp="http://schemas.openxmlformats.org/drawingml/2006/wordprocessingDrawing" xmlns:w10="urn:schemas-microsoft-com:office:word" xmlns:w="http://schemas.openxmlformats.org/wordprocessingml/2006/main" xmlns:w14="http://schemas.microsoft.com/office/word/2010/wordml" xmlns:w15="http://schemas.microsoft.com/office/word/2012/wordml" xmlns:w16cex="http://schemas.microsoft.com/office/word/2018/wordml/cex" xmlns:w16cid="http://schemas.microsoft.com/office/word/2016/wordml/cid" xmlns:w16="http://schemas.microsoft.com/office/word/2018/wordml" xmlns:w16du="http://schemas.microsoft.com/office/word/2023/wordml/word16du" xmlns:w16sdtdh="http://schemas.microsoft.com/office/word/2020/wordml/sdtdatahash" xmlns:w16sdtfl="http://schemas.microsoft.com/office/word/2024/wordml/sdtformatlock" xmlns:w16se="http://schemas.microsoft.com/office/word/2015/wordml/symex" xmlns:wpg="http://schemas.microsoft.com/office/word/2010/wordprocessingGroup" xmlns:wpi="http://schemas.microsoft.com/office/word/2010/wordprocessingInk" xmlns:wne="http://schemas.microsoft.com/office/word/2006/wordml" xmlns:wps="http://schemas.microsoft.com/office/word/2010/wordprocessingShape" mc:Ignorable="w14 w15 w16se w16cid w16 w16cex w16sdtdh w16sdtfl w16du wp14">
+<w:ftr xmlns:wpc="http://schemas.microsoft.com/office/word/2010/wordprocessingCanvas" xmlns:cx="http://schemas.microsoft.com/office/drawing/2014/chartex" xmlns:cx1="http://schemas.microsoft.com/office/drawing/2015/9/8/chartex" xmlns:cx2="http://schemas.microsoft.com/office/drawing/2015/10/21/chartex" xmlns:cx3="http://schemas.microsoft.com/office/drawing/2016/5/9/chartex" xmlns:cx4="http://schemas.microsoft.com/office/drawing/2016/5/10/chartex" xmlns:cx5="http://schemas.microsoft.com/office/drawing/2016/5/11/chartex" xmlns:cx6="http://schemas.microsoft.com/office/drawing/2016/5/12/chartex" xmlns:cx7="http://schemas.microsoft.com/office/drawing/2016/5/13/chartex" xmlns:cx8="http://schemas.microsoft.com/office/drawing/2016/5/14/chartex" xmlns:mc="http://schemas.openxmlformats.org/markup-compatibility/2006" xmlns:aink="http://schemas.microsoft.com/office/drawing/2016/ink" xmlns:am3d="http://schemas.microsoft.com/office/drawing/2017/model3d" xmlns:o="urn:schemas-microsoft-com:office:office" xmlns:oel="http://schemas.microsoft.com/office/2019/extlst" xmlns:r="http://schemas.openxmlformats.org/officeDocument/2006/relationships" xmlns:m="http://schemas.openxmlformats.org/officeDocument/2006/math" xmlns:v="urn:schemas-microsoft-com:vml" xmlns:wp14="http://schemas.microsoft.com/office/word/2010/wordprocessingDrawing" xmlns:wp="http://schemas.openxmlformats.org/drawingml/2006/wordprocessingDrawing" xmlns:w10="urn:schemas-microsoft-com:office:word" xmlns:w="http://schemas.openxmlformats.org/wordprocessingml/2006/main" xmlns:w14="http://schemas.microsoft.com/office/word/2010/wordml" xmlns:w15="http://schemas.microsoft.com/office/word/2012/wordml" xmlns:w16cex="http://schemas.microsoft.com/office/word/2018/wordml/cex" xmlns:w16cid="http://schemas.microsoft.com/office/word/2016/wordml/cid" xmlns:w16="http://schemas.microsoft.com/office/word/2018/wordml" xmlns:w16sdtdh="http://schemas.microsoft.com/office/word/2020/wordml/sdtdatahash" xmlns:w16se="http://schemas.microsoft.com/office/word/2015/wordml/symex" xmlns:wpg="http://schemas.microsoft.com/office/word/2010/wordprocessingGroup" xmlns:wpi="http://schemas.microsoft.com/office/word/2010/wordprocessingInk" xmlns:wne="http://schemas.microsoft.com/office/word/2006/wordml" xmlns:wps="http://schemas.microsoft.com/office/word/2010/wordprocessingShape" mc:Ignorable="w14 w15 w16se w16cid w16 w16cex w16sdtdh wp14">
   <w:p>
     <w:pPr>
       <w:pStyle w:val="Footer"/>
@@ -7316,7 +7419,7 @@
 </file>
 
 <file path=word/footnotes.xml><?xml version="1.0" encoding="utf-8"?>
-<w:footnotes xmlns:wpc="http://schemas.microsoft.com/office/word/2010/wordprocessingCanvas" xmlns:cx="http://schemas.microsoft.com/office/drawing/2014/chartex" xmlns:cx1="http://schemas.microsoft.com/office/drawing/2015/9/8/chartex" xmlns:cx2="http://schemas.microsoft.com/office/drawing/2015/10/21/chartex" xmlns:cx3="http://schemas.microsoft.com/office/drawing/2016/5/9/chartex" xmlns:cx4="http://schemas.microsoft.com/office/drawing/2016/5/10/chartex" xmlns:cx5="http://schemas.microsoft.com/office/drawing/2016/5/11/chartex" xmlns:cx6="http://schemas.microsoft.com/office/drawing/2016/5/12/chartex" xmlns:cx7="http://schemas.microsoft.com/office/drawing/2016/5/13/chartex" xmlns:cx8="http://schemas.microsoft.com/office/drawing/2016/5/14/chartex" xmlns:mc="http://schemas.openxmlformats.org/markup-compatibility/2006" xmlns:aink="http://schemas.microsoft.com/office/drawing/2016/ink" xmlns:am3d="http://schemas.microsoft.com/office/drawing/2017/model3d" xmlns:o="urn:schemas-microsoft-com:office:office" xmlns:oel="http://schemas.microsoft.com/office/2019/extlst" xmlns:r="http://schemas.openxmlformats.org/officeDocument/2006/relationships" xmlns:m="http://schemas.openxmlformats.org/officeDocument/2006/math" xmlns:v="urn:schemas-microsoft-com:vml" xmlns:wp14="http://schemas.microsoft.com/office/word/2010/wordprocessingDrawing" xmlns:wp="http://schemas.openxmlformats.org/drawingml/2006/wordprocessingDrawing" xmlns:w10="urn:schemas-microsoft-com:office:word" xmlns:w="http://schemas.openxmlformats.org/wordprocessingml/2006/main" xmlns:w14="http://schemas.microsoft.com/office/word/2010/wordml" xmlns:w15="http://schemas.microsoft.com/office/word/2012/wordml" xmlns:w16cex="http://schemas.microsoft.com/office/word/2018/wordml/cex" xmlns:w16cid="http://schemas.microsoft.com/office/word/2016/wordml/cid" xmlns:w16="http://schemas.microsoft.com/office/word/2018/wordml" xmlns:w16du="http://schemas.microsoft.com/office/word/2023/wordml/word16du" xmlns:w16sdtdh="http://schemas.microsoft.com/office/word/2020/wordml/sdtdatahash" xmlns:w16sdtfl="http://schemas.microsoft.com/office/word/2024/wordml/sdtformatlock" xmlns:w16se="http://schemas.microsoft.com/office/word/2015/wordml/symex" xmlns:wpg="http://schemas.microsoft.com/office/word/2010/wordprocessingGroup" xmlns:wpi="http://schemas.microsoft.com/office/word/2010/wordprocessingInk" xmlns:wne="http://schemas.microsoft.com/office/word/2006/wordml" xmlns:wps="http://schemas.microsoft.com/office/word/2010/wordprocessingShape" mc:Ignorable="w14 w15 w16se w16cid w16 w16cex w16sdtdh w16sdtfl w16du wp14">
+<w:footnotes xmlns:wpc="http://schemas.microsoft.com/office/word/2010/wordprocessingCanvas" xmlns:cx="http://schemas.microsoft.com/office/drawing/2014/chartex" xmlns:cx1="http://schemas.microsoft.com/office/drawing/2015/9/8/chartex" xmlns:cx2="http://schemas.microsoft.com/office/drawing/2015/10/21/chartex" xmlns:cx3="http://schemas.microsoft.com/office/drawing/2016/5/9/chartex" xmlns:cx4="http://schemas.microsoft.com/office/drawing/2016/5/10/chartex" xmlns:cx5="http://schemas.microsoft.com/office/drawing/2016/5/11/chartex" xmlns:cx6="http://schemas.microsoft.com/office/drawing/2016/5/12/chartex" xmlns:cx7="http://schemas.microsoft.com/office/drawing/2016/5/13/chartex" xmlns:cx8="http://schemas.microsoft.com/office/drawing/2016/5/14/chartex" xmlns:mc="http://schemas.openxmlformats.org/markup-compatibility/2006" xmlns:aink="http://schemas.microsoft.com/office/drawing/2016/ink" xmlns:am3d="http://schemas.microsoft.com/office/drawing/2017/model3d" xmlns:o="urn:schemas-microsoft-com:office:office" xmlns:oel="http://schemas.microsoft.com/office/2019/extlst" xmlns:r="http://schemas.openxmlformats.org/officeDocument/2006/relationships" xmlns:m="http://schemas.openxmlformats.org/officeDocument/2006/math" xmlns:v="urn:schemas-microsoft-com:vml" xmlns:wp14="http://schemas.microsoft.com/office/word/2010/wordprocessingDrawing" xmlns:wp="http://schemas.openxmlformats.org/drawingml/2006/wordprocessingDrawing" xmlns:w10="urn:schemas-microsoft-com:office:word" xmlns:w="http://schemas.openxmlformats.org/wordprocessingml/2006/main" xmlns:w14="http://schemas.microsoft.com/office/word/2010/wordml" xmlns:w15="http://schemas.microsoft.com/office/word/2012/wordml" xmlns:w16cex="http://schemas.microsoft.com/office/word/2018/wordml/cex" xmlns:w16cid="http://schemas.microsoft.com/office/word/2016/wordml/cid" xmlns:w16="http://schemas.microsoft.com/office/word/2018/wordml" xmlns:w16sdtdh="http://schemas.microsoft.com/office/word/2020/wordml/sdtdatahash" xmlns:w16se="http://schemas.microsoft.com/office/word/2015/wordml/symex" xmlns:wpg="http://schemas.microsoft.com/office/word/2010/wordprocessingGroup" xmlns:wpi="http://schemas.microsoft.com/office/word/2010/wordprocessingInk" xmlns:wne="http://schemas.microsoft.com/office/word/2006/wordml" xmlns:wps="http://schemas.microsoft.com/office/word/2010/wordprocessingShape" mc:Ignorable="w14 w15 w16se w16cid w16 w16cex w16sdtdh wp14">
   <w:footnote w:type="separator" w:id="-1">
     <w:p>
       <w:pPr>
@@ -7341,7 +7444,7 @@
 </file>
 
 <file path=word/header1.xml><?xml version="1.0" encoding="utf-8"?>
-<w:hdr xmlns:wpc="http://schemas.microsoft.com/office/word/2010/wordprocessingCanvas" xmlns:cx="http://schemas.microsoft.com/office/drawing/2014/chartex" xmlns:cx1="http://schemas.microsoft.com/office/drawing/2015/9/8/chartex" xmlns:cx2="http://schemas.microsoft.com/office/drawing/2015/10/21/chartex" xmlns:cx3="http://schemas.microsoft.com/office/drawing/2016/5/9/chartex" xmlns:cx4="http://schemas.microsoft.com/office/drawing/2016/5/10/chartex" xmlns:cx5="http://schemas.microsoft.com/office/drawing/2016/5/11/chartex" xmlns:cx6="http://schemas.microsoft.com/office/drawing/2016/5/12/chartex" xmlns:cx7="http://schemas.microsoft.com/office/drawing/2016/5/13/chartex" xmlns:cx8="http://schemas.microsoft.com/office/drawing/2016/5/14/chartex" xmlns:mc="http://schemas.openxmlformats.org/markup-compatibility/2006" xmlns:aink="http://schemas.microsoft.com/office/drawing/2016/ink" xmlns:am3d="http://schemas.microsoft.com/office/drawing/2017/model3d" xmlns:o="urn:schemas-microsoft-com:office:office" xmlns:oel="http://schemas.microsoft.com/office/2019/extlst" xmlns:r="http://schemas.openxmlformats.org/officeDocument/2006/relationships" xmlns:m="http://schemas.openxmlformats.org/officeDocument/2006/math" xmlns:v="urn:schemas-microsoft-com:vml" xmlns:wp14="http://schemas.microsoft.com/office/word/2010/wordprocessingDrawing" xmlns:wp="http://schemas.openxmlformats.org/drawingml/2006/wordprocessingDrawing" xmlns:w10="urn:schemas-microsoft-com:office:word" xmlns:w="http://schemas.openxmlformats.org/wordprocessingml/2006/main" xmlns:w14="http://schemas.microsoft.com/office/word/2010/wordml" xmlns:w15="http://schemas.microsoft.com/office/word/2012/wordml" xmlns:w16cex="http://schemas.microsoft.com/office/word/2018/wordml/cex" xmlns:w16cid="http://schemas.microsoft.com/office/word/2016/wordml/cid" xmlns:w16="http://schemas.microsoft.com/office/word/2018/wordml" xmlns:w16du="http://schemas.microsoft.com/office/word/2023/wordml/word16du" xmlns:w16sdtdh="http://schemas.microsoft.com/office/word/2020/wordml/sdtdatahash" xmlns:w16sdtfl="http://schemas.microsoft.com/office/word/2024/wordml/sdtformatlock" xmlns:w16se="http://schemas.microsoft.com/office/word/2015/wordml/symex" xmlns:wpg="http://schemas.microsoft.com/office/word/2010/wordprocessingGroup" xmlns:wpi="http://schemas.microsoft.com/office/word/2010/wordprocessingInk" xmlns:wne="http://schemas.microsoft.com/office/word/2006/wordml" xmlns:wps="http://schemas.microsoft.com/office/word/2010/wordprocessingShape" mc:Ignorable="w14 w15 w16se w16cid w16 w16cex w16sdtdh w16sdtfl w16du wp14">
+<w:hdr xmlns:wpc="http://schemas.microsoft.com/office/word/2010/wordprocessingCanvas" xmlns:cx="http://schemas.microsoft.com/office/drawing/2014/chartex" xmlns:cx1="http://schemas.microsoft.com/office/drawing/2015/9/8/chartex" xmlns:cx2="http://schemas.microsoft.com/office/drawing/2015/10/21/chartex" xmlns:cx3="http://schemas.microsoft.com/office/drawing/2016/5/9/chartex" xmlns:cx4="http://schemas.microsoft.com/office/drawing/2016/5/10/chartex" xmlns:cx5="http://schemas.microsoft.com/office/drawing/2016/5/11/chartex" xmlns:cx6="http://schemas.microsoft.com/office/drawing/2016/5/12/chartex" xmlns:cx7="http://schemas.microsoft.com/office/drawing/2016/5/13/chartex" xmlns:cx8="http://schemas.microsoft.com/office/drawing/2016/5/14/chartex" xmlns:mc="http://schemas.openxmlformats.org/markup-compatibility/2006" xmlns:aink="http://schemas.microsoft.com/office/drawing/2016/ink" xmlns:am3d="http://schemas.microsoft.com/office/drawing/2017/model3d" xmlns:o="urn:schemas-microsoft-com:office:office" xmlns:oel="http://schemas.microsoft.com/office/2019/extlst" xmlns:r="http://schemas.openxmlformats.org/officeDocument/2006/relationships" xmlns:m="http://schemas.openxmlformats.org/officeDocument/2006/math" xmlns:v="urn:schemas-microsoft-com:vml" xmlns:wp14="http://schemas.microsoft.com/office/word/2010/wordprocessingDrawing" xmlns:wp="http://schemas.openxmlformats.org/drawingml/2006/wordprocessingDrawing" xmlns:w10="urn:schemas-microsoft-com:office:word" xmlns:w="http://schemas.openxmlformats.org/wordprocessingml/2006/main" xmlns:w14="http://schemas.microsoft.com/office/word/2010/wordml" xmlns:w15="http://schemas.microsoft.com/office/word/2012/wordml" xmlns:w16cex="http://schemas.microsoft.com/office/word/2018/wordml/cex" xmlns:w16cid="http://schemas.microsoft.com/office/word/2016/wordml/cid" xmlns:w16="http://schemas.microsoft.com/office/word/2018/wordml" xmlns:w16sdtdh="http://schemas.microsoft.com/office/word/2020/wordml/sdtdatahash" xmlns:w16se="http://schemas.microsoft.com/office/word/2015/wordml/symex" xmlns:wpg="http://schemas.microsoft.com/office/word/2010/wordprocessingGroup" xmlns:wpi="http://schemas.microsoft.com/office/word/2010/wordprocessingInk" xmlns:wne="http://schemas.microsoft.com/office/word/2006/wordml" xmlns:wps="http://schemas.microsoft.com/office/word/2010/wordprocessingShape" mc:Ignorable="w14 w15 w16se w16cid w16 w16cex w16sdtdh wp14">
   <w:p>
     <w:pPr>
       <w:pStyle w:val="Header"/>
@@ -7355,7 +7458,7 @@
 </file>
 
 <file path=word/header2.xml><?xml version="1.0" encoding="utf-8"?>
-<w:hdr xmlns:wpc="http://schemas.microsoft.com/office/word/2010/wordprocessingCanvas" xmlns:cx="http://schemas.microsoft.com/office/drawing/2014/chartex" xmlns:cx1="http://schemas.microsoft.com/office/drawing/2015/9/8/chartex" xmlns:cx2="http://schemas.microsoft.com/office/drawing/2015/10/21/chartex" xmlns:cx3="http://schemas.microsoft.com/office/drawing/2016/5/9/chartex" xmlns:cx4="http://schemas.microsoft.com/office/drawing/2016/5/10/chartex" xmlns:cx5="http://schemas.microsoft.com/office/drawing/2016/5/11/chartex" xmlns:cx6="http://schemas.microsoft.com/office/drawing/2016/5/12/chartex" xmlns:cx7="http://schemas.microsoft.com/office/drawing/2016/5/13/chartex" xmlns:cx8="http://schemas.microsoft.com/office/drawing/2016/5/14/chartex" xmlns:mc="http://schemas.openxmlformats.org/markup-compatibility/2006" xmlns:aink="http://schemas.microsoft.com/office/drawing/2016/ink" xmlns:am3d="http://schemas.microsoft.com/office/drawing/2017/model3d" xmlns:o="urn:schemas-microsoft-com:office:office" xmlns:oel="http://schemas.microsoft.com/office/2019/extlst" xmlns:r="http://schemas.openxmlformats.org/officeDocument/2006/relationships" xmlns:m="http://schemas.openxmlformats.org/officeDocument/2006/math" xmlns:v="urn:schemas-microsoft-com:vml" xmlns:wp14="http://schemas.microsoft.com/office/word/2010/wordprocessingDrawing" xmlns:wp="http://schemas.openxmlformats.org/drawingml/2006/wordprocessingDrawing" xmlns:w10="urn:schemas-microsoft-com:office:word" xmlns:w="http://schemas.openxmlformats.org/wordprocessingml/2006/main" xmlns:w14="http://schemas.microsoft.com/office/word/2010/wordml" xmlns:w15="http://schemas.microsoft.com/office/word/2012/wordml" xmlns:w16cex="http://schemas.microsoft.com/office/word/2018/wordml/cex" xmlns:w16cid="http://schemas.microsoft.com/office/word/2016/wordml/cid" xmlns:w16="http://schemas.microsoft.com/office/word/2018/wordml" xmlns:w16du="http://schemas.microsoft.com/office/word/2023/wordml/word16du" xmlns:w16sdtdh="http://schemas.microsoft.com/office/word/2020/wordml/sdtdatahash" xmlns:w16sdtfl="http://schemas.microsoft.com/office/word/2024/wordml/sdtformatlock" xmlns:w16se="http://schemas.microsoft.com/office/word/2015/wordml/symex" xmlns:wpg="http://schemas.microsoft.com/office/word/2010/wordprocessingGroup" xmlns:wpi="http://schemas.microsoft.com/office/word/2010/wordprocessingInk" xmlns:wne="http://schemas.microsoft.com/office/word/2006/wordml" xmlns:wps="http://schemas.microsoft.com/office/word/2010/wordprocessingShape" mc:Ignorable="w14 w15 w16se w16cid w16 w16cex w16sdtdh w16sdtfl w16du wp14">
+<w:hdr xmlns:wpc="http://schemas.microsoft.com/office/word/2010/wordprocessingCanvas" xmlns:cx="http://schemas.microsoft.com/office/drawing/2014/chartex" xmlns:cx1="http://schemas.microsoft.com/office/drawing/2015/9/8/chartex" xmlns:cx2="http://schemas.microsoft.com/office/drawing/2015/10/21/chartex" xmlns:cx3="http://schemas.microsoft.com/office/drawing/2016/5/9/chartex" xmlns:cx4="http://schemas.microsoft.com/office/drawing/2016/5/10/chartex" xmlns:cx5="http://schemas.microsoft.com/office/drawing/2016/5/11/chartex" xmlns:cx6="http://schemas.microsoft.com/office/drawing/2016/5/12/chartex" xmlns:cx7="http://schemas.microsoft.com/office/drawing/2016/5/13/chartex" xmlns:cx8="http://schemas.microsoft.com/office/drawing/2016/5/14/chartex" xmlns:mc="http://schemas.openxmlformats.org/markup-compatibility/2006" xmlns:aink="http://schemas.microsoft.com/office/drawing/2016/ink" xmlns:am3d="http://schemas.microsoft.com/office/drawing/2017/model3d" xmlns:o="urn:schemas-microsoft-com:office:office" xmlns:oel="http://schemas.microsoft.com/office/2019/extlst" xmlns:r="http://schemas.openxmlformats.org/officeDocument/2006/relationships" xmlns:m="http://schemas.openxmlformats.org/officeDocument/2006/math" xmlns:v="urn:schemas-microsoft-com:vml" xmlns:wp14="http://schemas.microsoft.com/office/word/2010/wordprocessingDrawing" xmlns:wp="http://schemas.openxmlformats.org/drawingml/2006/wordprocessingDrawing" xmlns:w10="urn:schemas-microsoft-com:office:word" xmlns:w="http://schemas.openxmlformats.org/wordprocessingml/2006/main" xmlns:w14="http://schemas.microsoft.com/office/word/2010/wordml" xmlns:w15="http://schemas.microsoft.com/office/word/2012/wordml" xmlns:w16cex="http://schemas.microsoft.com/office/word/2018/wordml/cex" xmlns:w16cid="http://schemas.microsoft.com/office/word/2016/wordml/cid" xmlns:w16="http://schemas.microsoft.com/office/word/2018/wordml" xmlns:w16sdtdh="http://schemas.microsoft.com/office/word/2020/wordml/sdtdatahash" xmlns:w16se="http://schemas.microsoft.com/office/word/2015/wordml/symex" xmlns:wpg="http://schemas.microsoft.com/office/word/2010/wordprocessingGroup" xmlns:wpi="http://schemas.microsoft.com/office/word/2010/wordprocessingInk" xmlns:wne="http://schemas.microsoft.com/office/word/2006/wordml" xmlns:wps="http://schemas.microsoft.com/office/word/2010/wordprocessingShape" mc:Ignorable="w14 w15 w16se w16cid w16 w16cex w16sdtdh wp14">
   <w:p>
     <w:pPr>
       <w:pStyle w:val="Header"/>
@@ -7369,7 +7472,7 @@
 </file>
 
 <file path=word/numbering.xml><?xml version="1.0" encoding="utf-8"?>
-<w:numbering xmlns:wpc="http://schemas.microsoft.com/office/word/2010/wordprocessingCanvas" xmlns:cx="http://schemas.microsoft.com/office/drawing/2014/chartex" xmlns:cx1="http://schemas.microsoft.com/office/drawing/2015/9/8/chartex" xmlns:cx2="http://schemas.microsoft.com/office/drawing/2015/10/21/chartex" xmlns:cx3="http://schemas.microsoft.com/office/drawing/2016/5/9/chartex" xmlns:cx4="http://schemas.microsoft.com/office/drawing/2016/5/10/chartex" xmlns:cx5="http://schemas.microsoft.com/office/drawing/2016/5/11/chartex" xmlns:cx6="http://schemas.microsoft.com/office/drawing/2016/5/12/chartex" xmlns:cx7="http://schemas.microsoft.com/office/drawing/2016/5/13/chartex" xmlns:cx8="http://schemas.microsoft.com/office/drawing/2016/5/14/chartex" xmlns:mc="http://schemas.openxmlformats.org/markup-compatibility/2006" xmlns:aink="http://schemas.microsoft.com/office/drawing/2016/ink" xmlns:am3d="http://schemas.microsoft.com/office/drawing/2017/model3d" xmlns:o="urn:schemas-microsoft-com:office:office" xmlns:oel="http://schemas.microsoft.com/office/2019/extlst" xmlns:r="http://schemas.openxmlformats.org/officeDocument/2006/relationships" xmlns:m="http://schemas.openxmlformats.org/officeDocument/2006/math" xmlns:v="urn:schemas-microsoft-com:vml" xmlns:wp14="http://schemas.microsoft.com/office/word/2010/wordprocessingDrawing" xmlns:wp="http://schemas.openxmlformats.org/drawingml/2006/wordprocessingDrawing" xmlns:w10="urn:schemas-microsoft-com:office:word" xmlns:w="http://schemas.openxmlformats.org/wordprocessingml/2006/main" xmlns:w14="http://schemas.microsoft.com/office/word/2010/wordml" xmlns:w15="http://schemas.microsoft.com/office/word/2012/wordml" xmlns:w16cex="http://schemas.microsoft.com/office/word/2018/wordml/cex" xmlns:w16cid="http://schemas.microsoft.com/office/word/2016/wordml/cid" xmlns:w16="http://schemas.microsoft.com/office/word/2018/wordml" xmlns:w16du="http://schemas.microsoft.com/office/word/2023/wordml/word16du" xmlns:w16sdtdh="http://schemas.microsoft.com/office/word/2020/wordml/sdtdatahash" xmlns:w16sdtfl="http://schemas.microsoft.com/office/word/2024/wordml/sdtformatlock" xmlns:w16se="http://schemas.microsoft.com/office/word/2015/wordml/symex" xmlns:wpg="http://schemas.microsoft.com/office/word/2010/wordprocessingGroup" xmlns:wpi="http://schemas.microsoft.com/office/word/2010/wordprocessingInk" xmlns:wne="http://schemas.microsoft.com/office/word/2006/wordml" xmlns:wps="http://schemas.microsoft.com/office/word/2010/wordprocessingShape" mc:Ignorable="w14 w15 w16se w16cid w16 w16cex w16sdtdh w16sdtfl w16du wp14">
+<w:numbering xmlns:wpc="http://schemas.microsoft.com/office/word/2010/wordprocessingCanvas" xmlns:cx="http://schemas.microsoft.com/office/drawing/2014/chartex" xmlns:cx1="http://schemas.microsoft.com/office/drawing/2015/9/8/chartex" xmlns:cx2="http://schemas.microsoft.com/office/drawing/2015/10/21/chartex" xmlns:cx3="http://schemas.microsoft.com/office/drawing/2016/5/9/chartex" xmlns:cx4="http://schemas.microsoft.com/office/drawing/2016/5/10/chartex" xmlns:cx5="http://schemas.microsoft.com/office/drawing/2016/5/11/chartex" xmlns:cx6="http://schemas.microsoft.com/office/drawing/2016/5/12/chartex" xmlns:cx7="http://schemas.microsoft.com/office/drawing/2016/5/13/chartex" xmlns:cx8="http://schemas.microsoft.com/office/drawing/2016/5/14/chartex" xmlns:mc="http://schemas.openxmlformats.org/markup-compatibility/2006" xmlns:aink="http://schemas.microsoft.com/office/drawing/2016/ink" xmlns:am3d="http://schemas.microsoft.com/office/drawing/2017/model3d" xmlns:o="urn:schemas-microsoft-com:office:office" xmlns:oel="http://schemas.microsoft.com/office/2019/extlst" xmlns:r="http://schemas.openxmlformats.org/officeDocument/2006/relationships" xmlns:m="http://schemas.openxmlformats.org/officeDocument/2006/math" xmlns:v="urn:schemas-microsoft-com:vml" xmlns:wp14="http://schemas.microsoft.com/office/word/2010/wordprocessingDrawing" xmlns:wp="http://schemas.openxmlformats.org/drawingml/2006/wordprocessingDrawing" xmlns:w10="urn:schemas-microsoft-com:office:word" xmlns:w="http://schemas.openxmlformats.org/wordprocessingml/2006/main" xmlns:w14="http://schemas.microsoft.com/office/word/2010/wordml" xmlns:w15="http://schemas.microsoft.com/office/word/2012/wordml" xmlns:w16cex="http://schemas.microsoft.com/office/word/2018/wordml/cex" xmlns:w16cid="http://schemas.microsoft.com/office/word/2016/wordml/cid" xmlns:w16="http://schemas.microsoft.com/office/word/2018/wordml" xmlns:w16sdtdh="http://schemas.microsoft.com/office/word/2020/wordml/sdtdatahash" xmlns:w16se="http://schemas.microsoft.com/office/word/2015/wordml/symex" xmlns:wpg="http://schemas.microsoft.com/office/word/2010/wordprocessingGroup" xmlns:wpi="http://schemas.microsoft.com/office/word/2010/wordprocessingInk" xmlns:wne="http://schemas.microsoft.com/office/word/2006/wordml" xmlns:wps="http://schemas.microsoft.com/office/word/2010/wordprocessingShape" mc:Ignorable="w14 w15 w16se w16cid w16 w16cex w16sdtdh wp14">
   <w:abstractNum w:abstractNumId="0" w15:restartNumberingAfterBreak="0">
     <w:nsid w:val="2A8F5C15"/>
     <w:multiLevelType w:val="singleLevel"/>
@@ -7394,7 +7497,7 @@
 </file>
 
 <file path=word/styles.xml><?xml version="1.0" encoding="utf-8"?>
-<w:styles xmlns:mc="http://schemas.openxmlformats.org/markup-compatibility/2006" xmlns:r="http://schemas.openxmlformats.org/officeDocument/2006/relationships" xmlns:w="http://schemas.openxmlformats.org/wordprocessingml/2006/main" xmlns:w14="http://schemas.microsoft.com/office/word/2010/wordml" xmlns:w15="http://schemas.microsoft.com/office/word/2012/wordml" xmlns:w16cex="http://schemas.microsoft.com/office/word/2018/wordml/cex" xmlns:w16cid="http://schemas.microsoft.com/office/word/2016/wordml/cid" xmlns:w16="http://schemas.microsoft.com/office/word/2018/wordml" xmlns:w16du="http://schemas.microsoft.com/office/word/2023/wordml/word16du" xmlns:w16sdtdh="http://schemas.microsoft.com/office/word/2020/wordml/sdtdatahash" xmlns:w16sdtfl="http://schemas.microsoft.com/office/word/2024/wordml/sdtformatlock" xmlns:w16se="http://schemas.microsoft.com/office/word/2015/wordml/symex" mc:Ignorable="w14 w15 w16se w16cid w16 w16cex w16sdtdh w16sdtfl w16du">
+<w:styles xmlns:mc="http://schemas.openxmlformats.org/markup-compatibility/2006" xmlns:r="http://schemas.openxmlformats.org/officeDocument/2006/relationships" xmlns:w="http://schemas.openxmlformats.org/wordprocessingml/2006/main" xmlns:w14="http://schemas.microsoft.com/office/word/2010/wordml" xmlns:w15="http://schemas.microsoft.com/office/word/2012/wordml" xmlns:w16cex="http://schemas.microsoft.com/office/word/2018/wordml/cex" xmlns:w16cid="http://schemas.microsoft.com/office/word/2016/wordml/cid" xmlns:w16="http://schemas.microsoft.com/office/word/2018/wordml" xmlns:w16sdtdh="http://schemas.microsoft.com/office/word/2020/wordml/sdtdatahash" xmlns:w16se="http://schemas.microsoft.com/office/word/2015/wordml/symex" mc:Ignorable="w14 w15 w16se w16cid w16 w16cex w16sdtdh">
   <w:docDefaults>
     <w:rPrDefault>
       <w:rPr>

</xml_diff>

<commit_message>
update bank confirmation template with new auditor details
</commit_message>
<xml_diff>
--- a/public/bahan/Konfirmasi-Bank-Template.docx
+++ b/public/bahan/Konfirmasi-Bank-Template.docx
@@ -181,7 +181,6 @@
         </w:rPr>
         <w:t xml:space="preserve">Kantor Akuntan Publik </w:t>
       </w:r>
-      <w:proofErr w:type="spellStart"/>
       <w:r>
         <w:rPr>
           <w:rFonts w:cs="Calibri"/>
@@ -189,10 +188,10 @@
           <w:color w:val="000000"/>
           <w:sz w:val="20"/>
           <w:szCs w:val="20"/>
-        </w:rPr>
-        <w:t>Kuncara</w:t>
-      </w:r>
-      <w:proofErr w:type="spellEnd"/>
+          <w:lang w:val="de-DE"/>
+        </w:rPr>
+        <w:t>Griselda, Wisnu &amp; Arum</w:t>
+      </w:r>
       <w:r>
         <w:rPr>
           <w:rFonts w:cs="Calibri"/>
@@ -200,21 +199,10 @@
           <w:color w:val="000000"/>
           <w:sz w:val="20"/>
           <w:szCs w:val="20"/>
-        </w:rPr>
-        <w:t xml:space="preserve"> Budi Santosa &amp; Rekan Cabang </w:t>
-      </w:r>
-      <w:proofErr w:type="spellStart"/>
-      <w:r>
-        <w:rPr>
-          <w:rFonts w:cs="Calibri"/>
-          <w:b/>
-          <w:color w:val="000000"/>
-          <w:sz w:val="20"/>
-          <w:szCs w:val="20"/>
-        </w:rPr>
-        <w:t>Samarinda</w:t>
-      </w:r>
-      <w:proofErr w:type="spellEnd"/>
+          <w:lang w:val="de-DE"/>
+        </w:rPr>
+        <w:t xml:space="preserve"> Cabang Samarinda</w:t>
+      </w:r>
       <w:r>
         <w:rPr>
           <w:rFonts w:cs="Calibri"/>
@@ -411,7 +399,7 @@
           <w:sz w:val="20"/>
           <w:szCs w:val="20"/>
         </w:rPr>
-        <w:t xml:space="preserve"> kap</w:t>
+        <w:t xml:space="preserve"> </w:t>
       </w:r>
       <w:r>
         <w:rPr>
@@ -420,7 +408,7 @@
           <w:sz w:val="20"/>
           <w:szCs w:val="20"/>
         </w:rPr>
-        <w:t>kuncarasamarinda</w:t>
+        <w:t>kapgwasmd</w:t>
       </w:r>
       <w:r>
         <w:rPr>

</xml_diff>